<commit_message>
Add UN speeches pandas project
</commit_message>
<xml_diff>
--- a/Submission 1.docx
+++ b/Submission 1.docx
@@ -17,7 +17,20 @@
       </w:r>
       <w:r>
         <w:br/>
-        <w:t>Tried out some different sizes of text after setting up the basic html file buildup, needed some help with the right order of when you write what. Tried to make it visible in the vs code program and found out about the tab system in vs code.</w:t>
+      </w:r>
+      <w:r>
+        <w:t xml:space="preserve">- </w:t>
+      </w:r>
+      <w:r>
+        <w:t>Tried out some different sizes of text after setting up the basic html file buildup, needed some help with the right order of when you write what.</w:t>
+      </w:r>
+    </w:p>
+    <w:p>
+      <w:r>
+        <w:t>-</w:t>
+      </w:r>
+      <w:r>
+        <w:t>Tried to make it visible in the vs code program and found out about the tab system in vs code.</w:t>
       </w:r>
       <w:r>
         <w:t xml:space="preserve"> </w:t>
@@ -55,8 +68,19 @@
       <w:r>
         <w:t xml:space="preserve"> element showing I have saved it or its not saved, that’s something I’m missing.</w:t>
       </w:r>
-      <w:r>
-        <w:t xml:space="preserve"> Played around with dropdown menu for the styles of text.</w:t>
+    </w:p>
+    <w:p>
+      <w:r>
+        <w:t>-</w:t>
+      </w:r>
+      <w:r>
+        <w:t xml:space="preserve">Played around with </w:t>
+      </w:r>
+      <w:r>
+        <w:t xml:space="preserve">the </w:t>
+      </w:r>
+      <w:r>
+        <w:t>dropdown menu for styles of text.</w:t>
       </w:r>
     </w:p>
     <w:p/>
@@ -78,7 +102,7 @@
                     <pic:cNvPicPr/>
                   </pic:nvPicPr>
                   <pic:blipFill>
-                    <a:blip r:embed="rId6"/>
+                    <a:blip r:embed="rId7"/>
                     <a:stretch>
                       <a:fillRect/>
                     </a:stretch>
@@ -118,7 +142,7 @@
                     <pic:cNvPicPr/>
                   </pic:nvPicPr>
                   <pic:blipFill>
-                    <a:blip r:embed="rId7"/>
+                    <a:blip r:embed="rId8"/>
                     <a:stretch>
                       <a:fillRect/>
                     </a:stretch>
@@ -145,7 +169,20 @@
       </w:r>
       <w:r>
         <w:br/>
-        <w:t>Read through the W3 Schools free course again after I had done of it some time ago and tried my best with some while if else loops with numbers and variables</w:t>
+      </w:r>
+      <w:r>
+        <w:t xml:space="preserve">- </w:t>
+      </w:r>
+      <w:r>
+        <w:t>Read through the W3 Schools free course again after I had done of it some time ago</w:t>
+      </w:r>
+    </w:p>
+    <w:p>
+      <w:r>
+        <w:t xml:space="preserve">- </w:t>
+      </w:r>
+      <w:r>
+        <w:t>tried my best with some while if else loops with numbers and variables</w:t>
       </w:r>
       <w:r>
         <w:t xml:space="preserve"> and print messages</w:t>
@@ -173,7 +210,7 @@
                     <pic:cNvPicPr/>
                   </pic:nvPicPr>
                   <pic:blipFill>
-                    <a:blip r:embed="rId8"/>
+                    <a:blip r:embed="rId9"/>
                     <a:stretch>
                       <a:fillRect/>
                     </a:stretch>
@@ -203,6 +240,13 @@
       </w:r>
     </w:p>
     <w:p>
+      <w:pPr>
+        <w:pStyle w:val="ListParagraph"/>
+        <w:numPr>
+          <w:ilvl w:val="0"/>
+          <w:numId w:val="3"/>
+        </w:numPr>
+      </w:pPr>
       <w:r>
         <w:t>T</w:t>
       </w:r>
@@ -241,11 +285,19 @@
         <w:t xml:space="preserve">t </w:t>
       </w:r>
       <w:r>
-        <w:t xml:space="preserve">really. </w:t>
-      </w:r>
-      <w:r>
-        <w:br/>
-        <w:t>How some broken python is still in my head but not really, and how this is really demanding but also helps since I kind of know the intention what I want, how to set it up structurally and what is possible so far, but not super safe in how to write it correctly the first time.</w:t>
+        <w:t>really.</w:t>
+      </w:r>
+    </w:p>
+    <w:p>
+      <w:pPr>
+        <w:pStyle w:val="ListParagraph"/>
+        <w:numPr>
+          <w:ilvl w:val="0"/>
+          <w:numId w:val="3"/>
+        </w:numPr>
+      </w:pPr>
+      <w:r>
+        <w:t>How I still have some broken python and the sense of how it needs to look in me, but I can’t put it down without looking at the tutorial again. But I think a sense for how it needs to be structured helps a lot.</w:t>
       </w:r>
     </w:p>
     <w:p/>
@@ -256,6 +308,13 @@
       </w:r>
     </w:p>
     <w:p>
+      <w:pPr>
+        <w:pStyle w:val="ListParagraph"/>
+        <w:numPr>
+          <w:ilvl w:val="0"/>
+          <w:numId w:val="3"/>
+        </w:numPr>
+      </w:pPr>
       <w:r>
         <w:t xml:space="preserve">Getting Git and </w:t>
       </w:r>
@@ -269,6 +328,13 @@
       </w:r>
     </w:p>
     <w:p>
+      <w:pPr>
+        <w:pStyle w:val="ListParagraph"/>
+        <w:numPr>
+          <w:ilvl w:val="0"/>
+          <w:numId w:val="3"/>
+        </w:numPr>
+      </w:pPr>
       <w:r>
         <w:t>Pushing, commit and sync files in vs code, I had to add some kind of name for it to save.</w:t>
       </w:r>
@@ -300,8 +366,42 @@
         <w:t xml:space="preserve"> looks pretty much the same.</w:t>
       </w:r>
     </w:p>
+    <w:p>
+      <w:pPr>
+        <w:pStyle w:val="ListParagraph"/>
+        <w:numPr>
+          <w:ilvl w:val="0"/>
+          <w:numId w:val="3"/>
+        </w:numPr>
+      </w:pPr>
+      <w:r>
+        <w:t xml:space="preserve">Maybe try Jupiter and or </w:t>
+      </w:r>
+      <w:proofErr w:type="spellStart"/>
+      <w:r>
+        <w:t>streamlit</w:t>
+      </w:r>
+      <w:proofErr w:type="spellEnd"/>
+      <w:r>
+        <w:t xml:space="preserve"> app</w:t>
+      </w:r>
+    </w:p>
+    <w:p/>
+    <w:p>
+      <w:proofErr w:type="spellStart"/>
+      <w:r>
+        <w:t>Github</w:t>
+      </w:r>
+      <w:proofErr w:type="spellEnd"/>
+      <w:r>
+        <w:t xml:space="preserve"> repo: </w:t>
+      </w:r>
+      <w:r>
+        <w:t>https://github.com/nicolascent03-cpu/Data-Analysis-with-Python</w:t>
+      </w:r>
+    </w:p>
     <w:sectPr>
-      <w:headerReference w:type="default" r:id="rId9"/>
+      <w:headerReference w:type="default" r:id="rId10"/>
       <w:pgSz w:w="12240" w:h="15840"/>
       <w:pgMar w:top="1440" w:right="1440" w:bottom="1440" w:left="1440" w:header="720" w:footer="720" w:gutter="0"/>
       <w:cols w:space="720"/>
@@ -380,6 +480,356 @@
     </w:r>
   </w:p>
 </w:hdr>
+</file>
+
+<file path=word/numbering.xml><?xml version="1.0" encoding="utf-8"?>
+<w:numbering xmlns:wpc="http://schemas.microsoft.com/office/word/2010/wordprocessingCanvas" xmlns:cx="http://schemas.microsoft.com/office/drawing/2014/chartex" xmlns:cx1="http://schemas.microsoft.com/office/drawing/2015/9/8/chartex" xmlns:cx2="http://schemas.microsoft.com/office/drawing/2015/10/21/chartex" xmlns:cx3="http://schemas.microsoft.com/office/drawing/2016/5/9/chartex" xmlns:cx4="http://schemas.microsoft.com/office/drawing/2016/5/10/chartex" xmlns:cx5="http://schemas.microsoft.com/office/drawing/2016/5/11/chartex" xmlns:cx6="http://schemas.microsoft.com/office/drawing/2016/5/12/chartex" xmlns:cx7="http://schemas.microsoft.com/office/drawing/2016/5/13/chartex" xmlns:cx8="http://schemas.microsoft.com/office/drawing/2016/5/14/chartex" xmlns:mc="http://schemas.openxmlformats.org/markup-compatibility/2006" xmlns:m="http://schemas.openxmlformats.org/officeDocument/2006/math" xmlns:aink="http://schemas.microsoft.com/office/drawing/2016/ink" xmlns:am3d="http://schemas.microsoft.com/office/drawing/2017/model3d" xmlns:oel="http://schemas.microsoft.com/office/2019/extlst" xmlns:r="http://schemas.openxmlformats.org/officeDocument/2006/relationships" xmlns:wp14="http://schemas.microsoft.com/office/word/2010/wordprocessingDrawing" xmlns:wp="http://schemas.openxmlformats.org/drawingml/2006/wordprocessingDrawing" xmlns:wpg="http://schemas.microsoft.com/office/word/2010/wordprocessingGroup" xmlns:wpi="http://schemas.microsoft.com/office/word/2010/wordprocessingInk" xmlns:wps="http://schemas.microsoft.com/office/word/2010/wordprocessingShape" xmlns:o="urn:schemas-microsoft-com:office:office" xmlns:v="urn:schemas-microsoft-com:vml" xmlns:w10="urn:schemas-microsoft-com:office:word" xmlns:w="http://schemas.openxmlformats.org/wordprocessingml/2006/main" xmlns:w14="http://schemas.microsoft.com/office/word/2010/wordml" xmlns:w15="http://schemas.microsoft.com/office/word/2012/wordml" xmlns:w16cex="http://schemas.microsoft.com/office/word/2018/wordml/cex" xmlns:w16cid="http://schemas.microsoft.com/office/word/2016/wordml/cid" xmlns:w16="http://schemas.microsoft.com/office/word/2018/wordml" xmlns:w16sdtdh="http://schemas.microsoft.com/office/word/2020/wordml/sdtdatahash" xmlns:w16sdtfl="http://schemas.microsoft.com/office/word/2024/wordml/sdtformatlock" xmlns:w16se="http://schemas.microsoft.com/office/word/2015/wordml/symex" xmlns:w16du="http://schemas.microsoft.com/office/word/2023/wordml/word16du" xmlns:wne="http://schemas.microsoft.com/office/word/2006/wordml" mc:Ignorable="w14 w15 w16se w16cid w16 w16cex w16sdtdh w16sdtfl w16du wp14">
+  <w:abstractNum w:abstractNumId="0" w15:restartNumberingAfterBreak="0">
+    <w:nsid w:val="1292138E"/>
+    <w:multiLevelType w:val="hybridMultilevel"/>
+    <w:tmpl w:val="67580CF2"/>
+    <w:lvl w:ilvl="0" w:tplc="ABA66A5A">
+      <w:numFmt w:val="bullet"/>
+      <w:lvlText w:val="-"/>
+      <w:lvlJc w:val="left"/>
+      <w:pPr>
+        <w:ind w:left="720" w:hanging="360"/>
+      </w:pPr>
+      <w:rPr>
+        <w:rFonts w:ascii="Aptos" w:eastAsiaTheme="minorHAnsi" w:hAnsi="Aptos" w:cstheme="minorBidi" w:hint="default"/>
+      </w:rPr>
+    </w:lvl>
+    <w:lvl w:ilvl="1" w:tplc="04090003" w:tentative="1">
+      <w:start w:val="1"/>
+      <w:numFmt w:val="bullet"/>
+      <w:lvlText w:val="o"/>
+      <w:lvlJc w:val="left"/>
+      <w:pPr>
+        <w:ind w:left="1440" w:hanging="360"/>
+      </w:pPr>
+      <w:rPr>
+        <w:rFonts w:ascii="Courier New" w:hAnsi="Courier New" w:cs="Courier New" w:hint="default"/>
+      </w:rPr>
+    </w:lvl>
+    <w:lvl w:ilvl="2" w:tplc="04090005" w:tentative="1">
+      <w:start w:val="1"/>
+      <w:numFmt w:val="bullet"/>
+      <w:lvlText w:val=""/>
+      <w:lvlJc w:val="left"/>
+      <w:pPr>
+        <w:ind w:left="2160" w:hanging="360"/>
+      </w:pPr>
+      <w:rPr>
+        <w:rFonts w:ascii="Wingdings" w:hAnsi="Wingdings" w:hint="default"/>
+      </w:rPr>
+    </w:lvl>
+    <w:lvl w:ilvl="3" w:tplc="04090001" w:tentative="1">
+      <w:start w:val="1"/>
+      <w:numFmt w:val="bullet"/>
+      <w:lvlText w:val=""/>
+      <w:lvlJc w:val="left"/>
+      <w:pPr>
+        <w:ind w:left="2880" w:hanging="360"/>
+      </w:pPr>
+      <w:rPr>
+        <w:rFonts w:ascii="Symbol" w:hAnsi="Symbol" w:hint="default"/>
+      </w:rPr>
+    </w:lvl>
+    <w:lvl w:ilvl="4" w:tplc="04090003" w:tentative="1">
+      <w:start w:val="1"/>
+      <w:numFmt w:val="bullet"/>
+      <w:lvlText w:val="o"/>
+      <w:lvlJc w:val="left"/>
+      <w:pPr>
+        <w:ind w:left="3600" w:hanging="360"/>
+      </w:pPr>
+      <w:rPr>
+        <w:rFonts w:ascii="Courier New" w:hAnsi="Courier New" w:cs="Courier New" w:hint="default"/>
+      </w:rPr>
+    </w:lvl>
+    <w:lvl w:ilvl="5" w:tplc="04090005" w:tentative="1">
+      <w:start w:val="1"/>
+      <w:numFmt w:val="bullet"/>
+      <w:lvlText w:val=""/>
+      <w:lvlJc w:val="left"/>
+      <w:pPr>
+        <w:ind w:left="4320" w:hanging="360"/>
+      </w:pPr>
+      <w:rPr>
+        <w:rFonts w:ascii="Wingdings" w:hAnsi="Wingdings" w:hint="default"/>
+      </w:rPr>
+    </w:lvl>
+    <w:lvl w:ilvl="6" w:tplc="04090001" w:tentative="1">
+      <w:start w:val="1"/>
+      <w:numFmt w:val="bullet"/>
+      <w:lvlText w:val=""/>
+      <w:lvlJc w:val="left"/>
+      <w:pPr>
+        <w:ind w:left="5040" w:hanging="360"/>
+      </w:pPr>
+      <w:rPr>
+        <w:rFonts w:ascii="Symbol" w:hAnsi="Symbol" w:hint="default"/>
+      </w:rPr>
+    </w:lvl>
+    <w:lvl w:ilvl="7" w:tplc="04090003" w:tentative="1">
+      <w:start w:val="1"/>
+      <w:numFmt w:val="bullet"/>
+      <w:lvlText w:val="o"/>
+      <w:lvlJc w:val="left"/>
+      <w:pPr>
+        <w:ind w:left="5760" w:hanging="360"/>
+      </w:pPr>
+      <w:rPr>
+        <w:rFonts w:ascii="Courier New" w:hAnsi="Courier New" w:cs="Courier New" w:hint="default"/>
+      </w:rPr>
+    </w:lvl>
+    <w:lvl w:ilvl="8" w:tplc="04090005" w:tentative="1">
+      <w:start w:val="1"/>
+      <w:numFmt w:val="bullet"/>
+      <w:lvlText w:val=""/>
+      <w:lvlJc w:val="left"/>
+      <w:pPr>
+        <w:ind w:left="6480" w:hanging="360"/>
+      </w:pPr>
+      <w:rPr>
+        <w:rFonts w:ascii="Wingdings" w:hAnsi="Wingdings" w:hint="default"/>
+      </w:rPr>
+    </w:lvl>
+  </w:abstractNum>
+  <w:abstractNum w:abstractNumId="1" w15:restartNumberingAfterBreak="0">
+    <w:nsid w:val="38555C92"/>
+    <w:multiLevelType w:val="hybridMultilevel"/>
+    <w:tmpl w:val="BBE26492"/>
+    <w:lvl w:ilvl="0" w:tplc="B448A40A">
+      <w:numFmt w:val="bullet"/>
+      <w:lvlText w:val="-"/>
+      <w:lvlJc w:val="left"/>
+      <w:pPr>
+        <w:ind w:left="720" w:hanging="360"/>
+      </w:pPr>
+      <w:rPr>
+        <w:rFonts w:ascii="Aptos" w:eastAsiaTheme="minorHAnsi" w:hAnsi="Aptos" w:cstheme="minorBidi" w:hint="default"/>
+      </w:rPr>
+    </w:lvl>
+    <w:lvl w:ilvl="1" w:tplc="04090003" w:tentative="1">
+      <w:start w:val="1"/>
+      <w:numFmt w:val="bullet"/>
+      <w:lvlText w:val="o"/>
+      <w:lvlJc w:val="left"/>
+      <w:pPr>
+        <w:ind w:left="1440" w:hanging="360"/>
+      </w:pPr>
+      <w:rPr>
+        <w:rFonts w:ascii="Courier New" w:hAnsi="Courier New" w:cs="Courier New" w:hint="default"/>
+      </w:rPr>
+    </w:lvl>
+    <w:lvl w:ilvl="2" w:tplc="04090005" w:tentative="1">
+      <w:start w:val="1"/>
+      <w:numFmt w:val="bullet"/>
+      <w:lvlText w:val=""/>
+      <w:lvlJc w:val="left"/>
+      <w:pPr>
+        <w:ind w:left="2160" w:hanging="360"/>
+      </w:pPr>
+      <w:rPr>
+        <w:rFonts w:ascii="Wingdings" w:hAnsi="Wingdings" w:hint="default"/>
+      </w:rPr>
+    </w:lvl>
+    <w:lvl w:ilvl="3" w:tplc="04090001" w:tentative="1">
+      <w:start w:val="1"/>
+      <w:numFmt w:val="bullet"/>
+      <w:lvlText w:val=""/>
+      <w:lvlJc w:val="left"/>
+      <w:pPr>
+        <w:ind w:left="2880" w:hanging="360"/>
+      </w:pPr>
+      <w:rPr>
+        <w:rFonts w:ascii="Symbol" w:hAnsi="Symbol" w:hint="default"/>
+      </w:rPr>
+    </w:lvl>
+    <w:lvl w:ilvl="4" w:tplc="04090003" w:tentative="1">
+      <w:start w:val="1"/>
+      <w:numFmt w:val="bullet"/>
+      <w:lvlText w:val="o"/>
+      <w:lvlJc w:val="left"/>
+      <w:pPr>
+        <w:ind w:left="3600" w:hanging="360"/>
+      </w:pPr>
+      <w:rPr>
+        <w:rFonts w:ascii="Courier New" w:hAnsi="Courier New" w:cs="Courier New" w:hint="default"/>
+      </w:rPr>
+    </w:lvl>
+    <w:lvl w:ilvl="5" w:tplc="04090005" w:tentative="1">
+      <w:start w:val="1"/>
+      <w:numFmt w:val="bullet"/>
+      <w:lvlText w:val=""/>
+      <w:lvlJc w:val="left"/>
+      <w:pPr>
+        <w:ind w:left="4320" w:hanging="360"/>
+      </w:pPr>
+      <w:rPr>
+        <w:rFonts w:ascii="Wingdings" w:hAnsi="Wingdings" w:hint="default"/>
+      </w:rPr>
+    </w:lvl>
+    <w:lvl w:ilvl="6" w:tplc="04090001" w:tentative="1">
+      <w:start w:val="1"/>
+      <w:numFmt w:val="bullet"/>
+      <w:lvlText w:val=""/>
+      <w:lvlJc w:val="left"/>
+      <w:pPr>
+        <w:ind w:left="5040" w:hanging="360"/>
+      </w:pPr>
+      <w:rPr>
+        <w:rFonts w:ascii="Symbol" w:hAnsi="Symbol" w:hint="default"/>
+      </w:rPr>
+    </w:lvl>
+    <w:lvl w:ilvl="7" w:tplc="04090003" w:tentative="1">
+      <w:start w:val="1"/>
+      <w:numFmt w:val="bullet"/>
+      <w:lvlText w:val="o"/>
+      <w:lvlJc w:val="left"/>
+      <w:pPr>
+        <w:ind w:left="5760" w:hanging="360"/>
+      </w:pPr>
+      <w:rPr>
+        <w:rFonts w:ascii="Courier New" w:hAnsi="Courier New" w:cs="Courier New" w:hint="default"/>
+      </w:rPr>
+    </w:lvl>
+    <w:lvl w:ilvl="8" w:tplc="04090005" w:tentative="1">
+      <w:start w:val="1"/>
+      <w:numFmt w:val="bullet"/>
+      <w:lvlText w:val=""/>
+      <w:lvlJc w:val="left"/>
+      <w:pPr>
+        <w:ind w:left="6480" w:hanging="360"/>
+      </w:pPr>
+      <w:rPr>
+        <w:rFonts w:ascii="Wingdings" w:hAnsi="Wingdings" w:hint="default"/>
+      </w:rPr>
+    </w:lvl>
+  </w:abstractNum>
+  <w:abstractNum w:abstractNumId="2" w15:restartNumberingAfterBreak="0">
+    <w:nsid w:val="38B9446B"/>
+    <w:multiLevelType w:val="hybridMultilevel"/>
+    <w:tmpl w:val="0F9071A4"/>
+    <w:lvl w:ilvl="0" w:tplc="33407C0A">
+      <w:numFmt w:val="bullet"/>
+      <w:lvlText w:val="-"/>
+      <w:lvlJc w:val="left"/>
+      <w:pPr>
+        <w:ind w:left="720" w:hanging="360"/>
+      </w:pPr>
+      <w:rPr>
+        <w:rFonts w:ascii="Aptos" w:eastAsiaTheme="minorHAnsi" w:hAnsi="Aptos" w:cstheme="minorBidi" w:hint="default"/>
+      </w:rPr>
+    </w:lvl>
+    <w:lvl w:ilvl="1" w:tplc="04090003" w:tentative="1">
+      <w:start w:val="1"/>
+      <w:numFmt w:val="bullet"/>
+      <w:lvlText w:val="o"/>
+      <w:lvlJc w:val="left"/>
+      <w:pPr>
+        <w:ind w:left="1440" w:hanging="360"/>
+      </w:pPr>
+      <w:rPr>
+        <w:rFonts w:ascii="Courier New" w:hAnsi="Courier New" w:cs="Courier New" w:hint="default"/>
+      </w:rPr>
+    </w:lvl>
+    <w:lvl w:ilvl="2" w:tplc="04090005" w:tentative="1">
+      <w:start w:val="1"/>
+      <w:numFmt w:val="bullet"/>
+      <w:lvlText w:val=""/>
+      <w:lvlJc w:val="left"/>
+      <w:pPr>
+        <w:ind w:left="2160" w:hanging="360"/>
+      </w:pPr>
+      <w:rPr>
+        <w:rFonts w:ascii="Wingdings" w:hAnsi="Wingdings" w:hint="default"/>
+      </w:rPr>
+    </w:lvl>
+    <w:lvl w:ilvl="3" w:tplc="04090001" w:tentative="1">
+      <w:start w:val="1"/>
+      <w:numFmt w:val="bullet"/>
+      <w:lvlText w:val=""/>
+      <w:lvlJc w:val="left"/>
+      <w:pPr>
+        <w:ind w:left="2880" w:hanging="360"/>
+      </w:pPr>
+      <w:rPr>
+        <w:rFonts w:ascii="Symbol" w:hAnsi="Symbol" w:hint="default"/>
+      </w:rPr>
+    </w:lvl>
+    <w:lvl w:ilvl="4" w:tplc="04090003" w:tentative="1">
+      <w:start w:val="1"/>
+      <w:numFmt w:val="bullet"/>
+      <w:lvlText w:val="o"/>
+      <w:lvlJc w:val="left"/>
+      <w:pPr>
+        <w:ind w:left="3600" w:hanging="360"/>
+      </w:pPr>
+      <w:rPr>
+        <w:rFonts w:ascii="Courier New" w:hAnsi="Courier New" w:cs="Courier New" w:hint="default"/>
+      </w:rPr>
+    </w:lvl>
+    <w:lvl w:ilvl="5" w:tplc="04090005" w:tentative="1">
+      <w:start w:val="1"/>
+      <w:numFmt w:val="bullet"/>
+      <w:lvlText w:val=""/>
+      <w:lvlJc w:val="left"/>
+      <w:pPr>
+        <w:ind w:left="4320" w:hanging="360"/>
+      </w:pPr>
+      <w:rPr>
+        <w:rFonts w:ascii="Wingdings" w:hAnsi="Wingdings" w:hint="default"/>
+      </w:rPr>
+    </w:lvl>
+    <w:lvl w:ilvl="6" w:tplc="04090001" w:tentative="1">
+      <w:start w:val="1"/>
+      <w:numFmt w:val="bullet"/>
+      <w:lvlText w:val=""/>
+      <w:lvlJc w:val="left"/>
+      <w:pPr>
+        <w:ind w:left="5040" w:hanging="360"/>
+      </w:pPr>
+      <w:rPr>
+        <w:rFonts w:ascii="Symbol" w:hAnsi="Symbol" w:hint="default"/>
+      </w:rPr>
+    </w:lvl>
+    <w:lvl w:ilvl="7" w:tplc="04090003" w:tentative="1">
+      <w:start w:val="1"/>
+      <w:numFmt w:val="bullet"/>
+      <w:lvlText w:val="o"/>
+      <w:lvlJc w:val="left"/>
+      <w:pPr>
+        <w:ind w:left="5760" w:hanging="360"/>
+      </w:pPr>
+      <w:rPr>
+        <w:rFonts w:ascii="Courier New" w:hAnsi="Courier New" w:cs="Courier New" w:hint="default"/>
+      </w:rPr>
+    </w:lvl>
+    <w:lvl w:ilvl="8" w:tplc="04090005" w:tentative="1">
+      <w:start w:val="1"/>
+      <w:numFmt w:val="bullet"/>
+      <w:lvlText w:val=""/>
+      <w:lvlJc w:val="left"/>
+      <w:pPr>
+        <w:ind w:left="6480" w:hanging="360"/>
+      </w:pPr>
+      <w:rPr>
+        <w:rFonts w:ascii="Wingdings" w:hAnsi="Wingdings" w:hint="default"/>
+      </w:rPr>
+    </w:lvl>
+  </w:abstractNum>
+  <w:num w:numId="1" w16cid:durableId="991904672">
+    <w:abstractNumId w:val="2"/>
+  </w:num>
+  <w:num w:numId="2" w16cid:durableId="116876440">
+    <w:abstractNumId w:val="1"/>
+  </w:num>
+  <w:num w:numId="3" w16cid:durableId="637035792">
+    <w:abstractNumId w:val="0"/>
+  </w:num>
+</w:numbering>
 </file>
 
 <file path=word/styles.xml><?xml version="1.0" encoding="utf-8"?>

</xml_diff>